<commit_message>
add new context diagram image
</commit_message>
<xml_diff>
--- a/03-จดหมายนำส่ง.docx
+++ b/03-จดหมายนำส่ง.docx
@@ -1,6 +1,6 @@
 
 <file path=word/document.xml><?xml version="1.0" encoding="utf-8"?>
-<w:document xmlns:wpc="http://schemas.microsoft.com/office/word/2010/wordprocessingCanvas" xmlns:cx="http://schemas.microsoft.com/office/drawing/2014/chartex" xmlns:cx1="http://schemas.microsoft.com/office/drawing/2015/9/8/chartex" xmlns:cx2="http://schemas.microsoft.com/office/drawing/2015/10/21/chartex" xmlns:cx3="http://schemas.microsoft.com/office/drawing/2016/5/9/chartex" xmlns:cx4="http://schemas.microsoft.com/office/drawing/2016/5/10/chartex" xmlns:cx5="http://schemas.microsoft.com/office/drawing/2016/5/11/chartex" xmlns:cx6="http://schemas.microsoft.com/office/drawing/2016/5/12/chartex" xmlns:cx7="http://schemas.microsoft.com/office/drawing/2016/5/13/chartex" xmlns:cx8="http://schemas.microsoft.com/office/drawing/2016/5/14/chartex" xmlns:mc="http://schemas.openxmlformats.org/markup-compatibility/2006" xmlns:aink="http://schemas.microsoft.com/office/drawing/2016/ink" xmlns:am3d="http://schemas.microsoft.com/office/drawing/2017/model3d" xmlns:o="urn:schemas-microsoft-com:office:office" xmlns:oel="http://schemas.microsoft.com/office/2019/extlst" xmlns:r="http://schemas.openxmlformats.org/officeDocument/2006/relationships" xmlns:m="http://schemas.openxmlformats.org/officeDocument/2006/math" xmlns:v="urn:schemas-microsoft-com:vml" xmlns:wp14="http://schemas.microsoft.com/office/word/2010/wordprocessingDrawing" xmlns:wp="http://schemas.openxmlformats.org/drawingml/2006/wordprocessingDrawing" xmlns:w10="urn:schemas-microsoft-com:office:word" xmlns:w="http://schemas.openxmlformats.org/wordprocessingml/2006/main" xmlns:w14="http://schemas.microsoft.com/office/word/2010/wordml" xmlns:w15="http://schemas.microsoft.com/office/word/2012/wordml" xmlns:w16cex="http://schemas.microsoft.com/office/word/2018/wordml/cex" xmlns:w16cid="http://schemas.microsoft.com/office/word/2016/wordml/cid" xmlns:w16="http://schemas.microsoft.com/office/word/2018/wordml" xmlns:w16du="http://schemas.microsoft.com/office/word/2023/wordml/word16du" xmlns:w16sdtdh="http://schemas.microsoft.com/office/word/2020/wordml/sdtdatahash" xmlns:w16sdtfl="http://schemas.microsoft.com/office/word/2024/wordml/sdtformatlock" xmlns:w16se="http://schemas.microsoft.com/office/word/2015/wordml/symex" xmlns:wpg="http://schemas.microsoft.com/office/word/2010/wordprocessingGroup" xmlns:wpi="http://schemas.microsoft.com/office/word/2010/wordprocessingInk" xmlns:wne="http://schemas.microsoft.com/office/word/2006/wordml" xmlns:wps="http://schemas.microsoft.com/office/word/2010/wordprocessingShape" mc:Ignorable="w14 w15 w16se w16cid w16 w16cex w16sdtdh w16sdtfl w16du wp14">
+<w:document xmlns:wpc="http://schemas.microsoft.com/office/word/2010/wordprocessingCanvas" xmlns:cx="http://schemas.microsoft.com/office/drawing/2014/chartex" xmlns:cx1="http://schemas.microsoft.com/office/drawing/2015/9/8/chartex" xmlns:cx2="http://schemas.microsoft.com/office/drawing/2015/10/21/chartex" xmlns:cx3="http://schemas.microsoft.com/office/drawing/2016/5/9/chartex" xmlns:cx4="http://schemas.microsoft.com/office/drawing/2016/5/10/chartex" xmlns:cx5="http://schemas.microsoft.com/office/drawing/2016/5/11/chartex" xmlns:cx6="http://schemas.microsoft.com/office/drawing/2016/5/12/chartex" xmlns:cx7="http://schemas.microsoft.com/office/drawing/2016/5/13/chartex" xmlns:cx8="http://schemas.microsoft.com/office/drawing/2016/5/14/chartex" xmlns:mc="http://schemas.openxmlformats.org/markup-compatibility/2006" xmlns:aink="http://schemas.microsoft.com/office/drawing/2016/ink" xmlns:am3d="http://schemas.microsoft.com/office/drawing/2017/model3d" xmlns:o="urn:schemas-microsoft-com:office:office" xmlns:r="http://schemas.openxmlformats.org/officeDocument/2006/relationships" xmlns:m="http://schemas.openxmlformats.org/officeDocument/2006/math" xmlns:v="urn:schemas-microsoft-com:vml" xmlns:wp14="http://schemas.microsoft.com/office/word/2010/wordprocessingDrawing" xmlns:wp="http://schemas.openxmlformats.org/drawingml/2006/wordprocessingDrawing" xmlns:w10="urn:schemas-microsoft-com:office:word" xmlns:w="http://schemas.openxmlformats.org/wordprocessingml/2006/main" xmlns:w14="http://schemas.microsoft.com/office/word/2010/wordml" xmlns:w15="http://schemas.microsoft.com/office/word/2012/wordml" xmlns:w16cex="http://schemas.microsoft.com/office/word/2018/wordml/cex" xmlns:w16cid="http://schemas.microsoft.com/office/word/2016/wordml/cid" xmlns:w16="http://schemas.microsoft.com/office/word/2018/wordml" xmlns:w16sdtdh="http://schemas.microsoft.com/office/word/2020/wordml/sdtdatahash" xmlns:w16se="http://schemas.microsoft.com/office/word/2015/wordml/symex" xmlns:wpg="http://schemas.microsoft.com/office/word/2010/wordprocessingGroup" xmlns:wpi="http://schemas.microsoft.com/office/word/2010/wordprocessingInk" xmlns:wne="http://schemas.microsoft.com/office/word/2006/wordml" xmlns:wps="http://schemas.microsoft.com/office/word/2010/wordprocessingShape" mc:Ignorable="w14 w15 w16se w16cid w16 w16cex w16sdtdh wp14">
   <w:body>
     <w:p>
       <w:pPr>
@@ -12,6 +12,15 @@
           <w:szCs w:val="32"/>
         </w:rPr>
       </w:pPr>
+      <w:r>
+        <w:rPr>
+          <w:rFonts w:ascii="TH SarabunPSK" w:hAnsi="TH SarabunPSK" w:cs="TH SarabunPSK" w:hint="cs"/>
+          <w:sz w:val="32"/>
+          <w:szCs w:val="32"/>
+          <w:cs/>
+        </w:rPr>
+        <w:t xml:space="preserve">      </w:t>
+      </w:r>
       <w:r>
         <w:rPr>
           <w:rFonts w:ascii="TH SarabunPSK" w:hAnsi="TH SarabunPSK" w:cs="TH SarabunPSK" w:hint="cs"/>
@@ -108,7 +117,7 @@
           <w:tab w:val="left" w:pos="4253"/>
         </w:tabs>
         <w:spacing w:after="0"/>
-        <w:ind w:firstLine="4253"/>
+        <w:ind w:firstLine="5387"/>
         <w:rPr>
           <w:rFonts w:ascii="TH SarabunPSK" w:hAnsi="TH SarabunPSK" w:cs="TH SarabunPSK"/>
           <w:sz w:val="32"/>
@@ -336,7 +345,7 @@
         </w:tabs>
         <w:spacing w:after="0"/>
         <w:rPr>
-          <w:rFonts w:ascii="TH SarabunPSK" w:hAnsi="TH SarabunPSK" w:cs="TH SarabunPSK" w:hint="cs"/>
+          <w:rFonts w:ascii="TH SarabunPSK" w:hAnsi="TH SarabunPSK" w:cs="TH SarabunPSK"/>
           <w:sz w:val="32"/>
           <w:szCs w:val="32"/>
           <w:cs/>
@@ -415,7 +424,76 @@
           <w:szCs w:val="32"/>
           <w:cs/>
         </w:rPr>
-        <w:t xml:space="preserve">และ </w:t>
+        <w:t>และ นาย</w:t>
+      </w:r>
+      <w:r>
+        <w:rPr>
+          <w:rFonts w:ascii="TH SarabunPSK" w:hAnsi="TH SarabunPSK" w:cs="TH SarabunPSK"/>
+          <w:sz w:val="32"/>
+          <w:szCs w:val="32"/>
+          <w:cs/>
+        </w:rPr>
+        <w:t>รัช</w:t>
+      </w:r>
+      <w:proofErr w:type="spellStart"/>
+      <w:r>
+        <w:rPr>
+          <w:rFonts w:ascii="TH SarabunPSK" w:hAnsi="TH SarabunPSK" w:cs="TH SarabunPSK"/>
+          <w:sz w:val="32"/>
+          <w:szCs w:val="32"/>
+          <w:cs/>
+        </w:rPr>
+        <w:t>ช์</w:t>
+      </w:r>
+      <w:proofErr w:type="spellEnd"/>
+      <w:r>
+        <w:rPr>
+          <w:rFonts w:ascii="TH SarabunPSK" w:hAnsi="TH SarabunPSK" w:cs="TH SarabunPSK"/>
+          <w:sz w:val="32"/>
+          <w:szCs w:val="32"/>
+          <w:cs/>
+        </w:rPr>
+        <w:t>ชกฤต</w:t>
+      </w:r>
+      <w:proofErr w:type="spellStart"/>
+      <w:r>
+        <w:rPr>
+          <w:rFonts w:ascii="TH SarabunPSK" w:hAnsi="TH SarabunPSK" w:cs="TH SarabunPSK"/>
+          <w:sz w:val="32"/>
+          <w:szCs w:val="32"/>
+          <w:cs/>
+        </w:rPr>
+        <w:t>ย์</w:t>
+      </w:r>
+      <w:proofErr w:type="spellEnd"/>
+      <w:r>
+        <w:rPr>
+          <w:rFonts w:ascii="TH SarabunPSK" w:hAnsi="TH SarabunPSK" w:cs="TH SarabunPSK"/>
+          <w:sz w:val="32"/>
+          <w:szCs w:val="32"/>
+          <w:cs/>
+        </w:rPr>
+        <w:t xml:space="preserve"> กิตติโชคธน</w:t>
+      </w:r>
+      <w:proofErr w:type="spellStart"/>
+      <w:r>
+        <w:rPr>
+          <w:rFonts w:ascii="TH SarabunPSK" w:hAnsi="TH SarabunPSK" w:cs="TH SarabunPSK"/>
+          <w:sz w:val="32"/>
+          <w:szCs w:val="32"/>
+          <w:cs/>
+        </w:rPr>
+        <w:t>วั</w:t>
+      </w:r>
+      <w:proofErr w:type="spellEnd"/>
+      <w:r>
+        <w:rPr>
+          <w:rFonts w:ascii="TH SarabunPSK" w:hAnsi="TH SarabunPSK" w:cs="TH SarabunPSK"/>
+          <w:sz w:val="32"/>
+          <w:szCs w:val="32"/>
+          <w:cs/>
+        </w:rPr>
+        <w:t>ชร์</w:t>
       </w:r>
       <w:r>
         <w:rPr>
@@ -424,76 +502,16 @@
           <w:szCs w:val="32"/>
           <w:cs/>
         </w:rPr>
-        <w:t>นาย</w:t>
-      </w:r>
-      <w:r>
-        <w:rPr>
-          <w:rFonts w:ascii="TH SarabunPSK" w:hAnsi="TH SarabunPSK" w:cs="TH SarabunPSK"/>
-          <w:sz w:val="32"/>
-          <w:szCs w:val="32"/>
-          <w:cs/>
-        </w:rPr>
-        <w:t>รัช</w:t>
-      </w:r>
-      <w:proofErr w:type="spellStart"/>
-      <w:r>
-        <w:rPr>
-          <w:rFonts w:ascii="TH SarabunPSK" w:hAnsi="TH SarabunPSK" w:cs="TH SarabunPSK"/>
-          <w:sz w:val="32"/>
-          <w:szCs w:val="32"/>
-          <w:cs/>
-        </w:rPr>
-        <w:t>ช์</w:t>
-      </w:r>
-      <w:proofErr w:type="spellEnd"/>
-      <w:r>
-        <w:rPr>
-          <w:rFonts w:ascii="TH SarabunPSK" w:hAnsi="TH SarabunPSK" w:cs="TH SarabunPSK"/>
-          <w:sz w:val="32"/>
-          <w:szCs w:val="32"/>
-          <w:cs/>
-        </w:rPr>
-        <w:t>ชกฤต</w:t>
-      </w:r>
-      <w:proofErr w:type="spellStart"/>
-      <w:r>
-        <w:rPr>
-          <w:rFonts w:ascii="TH SarabunPSK" w:hAnsi="TH SarabunPSK" w:cs="TH SarabunPSK"/>
-          <w:sz w:val="32"/>
-          <w:szCs w:val="32"/>
-          <w:cs/>
-        </w:rPr>
-        <w:t>ย์</w:t>
-      </w:r>
-      <w:proofErr w:type="spellEnd"/>
-      <w:r>
-        <w:rPr>
-          <w:rFonts w:ascii="TH SarabunPSK" w:hAnsi="TH SarabunPSK" w:cs="TH SarabunPSK"/>
-          <w:sz w:val="32"/>
-          <w:szCs w:val="32"/>
-          <w:cs/>
-        </w:rPr>
-        <w:t xml:space="preserve"> กิตติโชคธน</w:t>
-      </w:r>
-      <w:proofErr w:type="spellStart"/>
-      <w:r>
-        <w:rPr>
-          <w:rFonts w:ascii="TH SarabunPSK" w:hAnsi="TH SarabunPSK" w:cs="TH SarabunPSK"/>
-          <w:sz w:val="32"/>
-          <w:szCs w:val="32"/>
-          <w:cs/>
-        </w:rPr>
-        <w:t>วั</w:t>
-      </w:r>
-      <w:proofErr w:type="spellEnd"/>
-      <w:r>
-        <w:rPr>
-          <w:rFonts w:ascii="TH SarabunPSK" w:hAnsi="TH SarabunPSK" w:cs="TH SarabunPSK"/>
-          <w:sz w:val="32"/>
-          <w:szCs w:val="32"/>
-          <w:cs/>
-        </w:rPr>
-        <w:t>ชร์</w:t>
+        <w:t xml:space="preserve"> </w:t>
+      </w:r>
+      <w:r>
+        <w:rPr>
+          <w:rFonts w:ascii="TH SarabunPSK" w:hAnsi="TH SarabunPSK" w:cs="TH SarabunPSK"/>
+          <w:sz w:val="32"/>
+          <w:szCs w:val="32"/>
+          <w:cs/>
+        </w:rPr>
+        <w:t>นักศึกษาสาขาวิชา</w:t>
       </w:r>
       <w:r>
         <w:rPr>
@@ -502,6 +520,87 @@
           <w:szCs w:val="32"/>
           <w:cs/>
         </w:rPr>
+        <w:t xml:space="preserve"> เทคโนโลยีสารสนเทศและนวัตกรรมดิจิทัล </w:t>
+      </w:r>
+      <w:r>
+        <w:rPr>
+          <w:rFonts w:ascii="TH SarabunPSK" w:hAnsi="TH SarabunPSK" w:cs="TH SarabunPSK"/>
+          <w:sz w:val="32"/>
+          <w:szCs w:val="32"/>
+          <w:cs/>
+        </w:rPr>
+        <w:t xml:space="preserve">คณะ </w:t>
+      </w:r>
+      <w:r>
+        <w:rPr>
+          <w:rFonts w:ascii="TH SarabunPSK" w:hAnsi="TH SarabunPSK" w:cs="TH SarabunPSK" w:hint="cs"/>
+          <w:sz w:val="32"/>
+          <w:szCs w:val="32"/>
+          <w:cs/>
+        </w:rPr>
+        <w:t>อุตสาหกรรมและเทคโนโลยี</w:t>
+      </w:r>
+      <w:r>
+        <w:rPr>
+          <w:rFonts w:ascii="TH SarabunPSK" w:hAnsi="TH SarabunPSK" w:cs="TH SarabunPSK"/>
+          <w:sz w:val="32"/>
+          <w:szCs w:val="32"/>
+          <w:cs/>
+        </w:rPr>
+        <w:t xml:space="preserve"> มหาวิทยาลัยเทคโนโลยีราชมงคลรัตนโกสินทร์ ได้</w:t>
+      </w:r>
+      <w:r>
+        <w:rPr>
+          <w:rFonts w:ascii="TH SarabunPSK" w:hAnsi="TH SarabunPSK" w:cs="TH SarabunPSK"/>
+          <w:sz w:val="32"/>
+          <w:szCs w:val="32"/>
+          <w:cs/>
+        </w:rPr>
+        <w:t xml:space="preserve">ปฏิบัติงานสหกิจศึกษา </w:t>
+      </w:r>
+      <w:r>
+        <w:rPr>
+          <w:rFonts w:ascii="TH SarabunPSK" w:hAnsi="TH SarabunPSK" w:cs="TH SarabunPSK"/>
+          <w:sz w:val="32"/>
+          <w:szCs w:val="32"/>
+          <w:cs/>
+        </w:rPr>
+        <w:t>ร</w:t>
+      </w:r>
+      <w:r>
+        <w:rPr>
+          <w:rFonts w:ascii="TH SarabunPSK" w:hAnsi="TH SarabunPSK" w:cs="TH SarabunPSK" w:hint="cs"/>
+          <w:sz w:val="32"/>
+          <w:szCs w:val="32"/>
+          <w:cs/>
+        </w:rPr>
+        <w:t>ะ</w:t>
+      </w:r>
+      <w:r>
+        <w:rPr>
+          <w:rFonts w:ascii="TH SarabunPSK" w:hAnsi="TH SarabunPSK" w:cs="TH SarabunPSK"/>
+          <w:sz w:val="32"/>
+          <w:szCs w:val="32"/>
+          <w:cs/>
+        </w:rPr>
+        <w:t>หว่าง</w:t>
+      </w:r>
+      <w:r>
+        <w:rPr>
+          <w:rFonts w:ascii="TH SarabunPSK" w:hAnsi="TH SarabunPSK" w:cs="TH SarabunPSK"/>
+          <w:sz w:val="32"/>
+          <w:szCs w:val="32"/>
+          <w:cs/>
+        </w:rPr>
+        <w:t>วันที่</w:t>
+      </w:r>
+      <w:r>
+        <w:rPr>
+          <w:rFonts w:ascii="TH SarabunPSK" w:hAnsi="TH SarabunPSK" w:cs="TH SarabunPSK"/>
+          <w:sz w:val="32"/>
+          <w:szCs w:val="32"/>
+          <w:cs/>
+        </w:rPr>
         <w:t xml:space="preserve"> </w:t>
       </w:r>
       <w:r>
@@ -509,9 +608,8 @@
           <w:rFonts w:ascii="TH SarabunPSK" w:hAnsi="TH SarabunPSK" w:cs="TH SarabunPSK"/>
           <w:sz w:val="32"/>
           <w:szCs w:val="32"/>
-          <w:cs/>
-        </w:rPr>
-        <w:t>นักศึกษาสาขาวิชา</w:t>
+        </w:rPr>
+        <w:t xml:space="preserve">30 </w:t>
       </w:r>
       <w:r>
         <w:rPr>
@@ -520,16 +618,41 @@
           <w:szCs w:val="32"/>
           <w:cs/>
         </w:rPr>
-        <w:t xml:space="preserve"> เทคโนโลยีสารสนเทศและนวัตกรรมดิจิทัล </w:t>
-      </w:r>
-      <w:r>
-        <w:rPr>
-          <w:rFonts w:ascii="TH SarabunPSK" w:hAnsi="TH SarabunPSK" w:cs="TH SarabunPSK"/>
-          <w:sz w:val="32"/>
-          <w:szCs w:val="32"/>
-          <w:cs/>
-        </w:rPr>
-        <w:t xml:space="preserve">คณะ </w:t>
+        <w:t xml:space="preserve">มิถุนายน </w:t>
+      </w:r>
+      <w:r>
+        <w:rPr>
+          <w:rFonts w:ascii="TH SarabunPSK" w:hAnsi="TH SarabunPSK" w:cs="TH SarabunPSK"/>
+          <w:sz w:val="32"/>
+          <w:szCs w:val="32"/>
+        </w:rPr>
+        <w:t xml:space="preserve">2568 </w:t>
+      </w:r>
+      <w:r>
+        <w:rPr>
+          <w:rFonts w:ascii="TH SarabunPSK" w:hAnsi="TH SarabunPSK" w:cs="TH SarabunPSK"/>
+          <w:sz w:val="32"/>
+          <w:szCs w:val="32"/>
+          <w:cs/>
+        </w:rPr>
+        <w:t>ถึงวันที่</w:t>
+      </w:r>
+      <w:r>
+        <w:rPr>
+          <w:rFonts w:ascii="TH SarabunPSK" w:hAnsi="TH SarabunPSK" w:cs="TH SarabunPSK"/>
+          <w:sz w:val="32"/>
+          <w:szCs w:val="32"/>
+          <w:cs/>
+        </w:rPr>
+        <w:t xml:space="preserve"> </w:t>
+      </w:r>
+      <w:r>
+        <w:rPr>
+          <w:rFonts w:ascii="TH SarabunPSK" w:hAnsi="TH SarabunPSK" w:cs="TH SarabunPSK"/>
+          <w:sz w:val="32"/>
+          <w:szCs w:val="32"/>
+        </w:rPr>
+        <w:t xml:space="preserve">17 </w:t>
       </w:r>
       <w:r>
         <w:rPr>
@@ -538,34 +661,15 @@
           <w:szCs w:val="32"/>
           <w:cs/>
         </w:rPr>
-        <w:t>อุตสาหกรรมและเทคโนโลยี</w:t>
-      </w:r>
-      <w:r>
-        <w:rPr>
-          <w:rFonts w:ascii="TH SarabunPSK" w:hAnsi="TH SarabunPSK" w:cs="TH SarabunPSK"/>
-          <w:sz w:val="32"/>
-          <w:szCs w:val="32"/>
-          <w:cs/>
-        </w:rPr>
-        <w:t xml:space="preserve"> มหาวิทยาลัยเทคโนโลยีราชมงคลรัตนโกสินทร์ ได้</w:t>
-      </w:r>
-      <w:r>
-        <w:rPr>
-          <w:rFonts w:ascii="TH SarabunPSK" w:hAnsi="TH SarabunPSK" w:cs="TH SarabunPSK"/>
-          <w:sz w:val="32"/>
-          <w:szCs w:val="32"/>
-          <w:cs/>
-        </w:rPr>
-        <w:t xml:space="preserve">ปฏิบัติงานสหกิจศึกษา </w:t>
-      </w:r>
-      <w:r>
-        <w:rPr>
-          <w:rFonts w:ascii="TH SarabunPSK" w:hAnsi="TH SarabunPSK" w:cs="TH SarabunPSK"/>
-          <w:sz w:val="32"/>
-          <w:szCs w:val="32"/>
-          <w:cs/>
-        </w:rPr>
-        <w:t>ร</w:t>
+        <w:t xml:space="preserve">ตุลาคม </w:t>
+      </w:r>
+      <w:r>
+        <w:rPr>
+          <w:rFonts w:ascii="TH SarabunPSK" w:hAnsi="TH SarabunPSK" w:cs="TH SarabunPSK"/>
+          <w:sz w:val="32"/>
+          <w:szCs w:val="32"/>
+        </w:rPr>
+        <w:t>2568</w:t>
       </w:r>
       <w:r>
         <w:rPr>
@@ -574,33 +678,6 @@
           <w:szCs w:val="32"/>
           <w:cs/>
         </w:rPr>
-        <w:t>ะ</w:t>
-      </w:r>
-      <w:r>
-        <w:rPr>
-          <w:rFonts w:ascii="TH SarabunPSK" w:hAnsi="TH SarabunPSK" w:cs="TH SarabunPSK"/>
-          <w:sz w:val="32"/>
-          <w:szCs w:val="32"/>
-          <w:cs/>
-        </w:rPr>
-        <w:t>หว่าง</w:t>
-      </w:r>
-      <w:r>
-        <w:rPr>
-          <w:rFonts w:ascii="TH SarabunPSK" w:hAnsi="TH SarabunPSK" w:cs="TH SarabunPSK"/>
-          <w:sz w:val="32"/>
-          <w:szCs w:val="32"/>
-          <w:cs/>
-        </w:rPr>
-        <w:t>วันที่</w:t>
-      </w:r>
-      <w:r>
-        <w:rPr>
-          <w:rFonts w:ascii="TH SarabunPSK" w:hAnsi="TH SarabunPSK" w:cs="TH SarabunPSK"/>
-          <w:sz w:val="32"/>
-          <w:szCs w:val="32"/>
-          <w:cs/>
-        </w:rPr>
         <w:t xml:space="preserve"> </w:t>
       </w:r>
       <w:r>
@@ -608,8 +685,17 @@
           <w:rFonts w:ascii="TH SarabunPSK" w:hAnsi="TH SarabunPSK" w:cs="TH SarabunPSK"/>
           <w:sz w:val="32"/>
           <w:szCs w:val="32"/>
-        </w:rPr>
-        <w:t xml:space="preserve">30 </w:t>
+          <w:cs/>
+        </w:rPr>
+        <w:t xml:space="preserve">ในตำแหน่ง </w:t>
+      </w:r>
+      <w:r>
+        <w:rPr>
+          <w:rFonts w:ascii="TH SarabunPSK" w:hAnsi="TH SarabunPSK" w:cs="TH SarabunPSK"/>
+          <w:sz w:val="32"/>
+          <w:szCs w:val="32"/>
+        </w:rPr>
+        <w:t>Web developer</w:t>
       </w:r>
       <w:r>
         <w:rPr>
@@ -618,32 +704,6 @@
           <w:szCs w:val="32"/>
           <w:cs/>
         </w:rPr>
-        <w:t xml:space="preserve">มิถุนายน </w:t>
-      </w:r>
-      <w:r>
-        <w:rPr>
-          <w:rFonts w:ascii="TH SarabunPSK" w:hAnsi="TH SarabunPSK" w:cs="TH SarabunPSK"/>
-          <w:sz w:val="32"/>
-          <w:szCs w:val="32"/>
-        </w:rPr>
-        <w:t xml:space="preserve">2568 </w:t>
-      </w:r>
-      <w:r>
-        <w:rPr>
-          <w:rFonts w:ascii="TH SarabunPSK" w:hAnsi="TH SarabunPSK" w:cs="TH SarabunPSK"/>
-          <w:sz w:val="32"/>
-          <w:szCs w:val="32"/>
-          <w:cs/>
-        </w:rPr>
-        <w:t>ถึงวันที่</w:t>
-      </w:r>
-      <w:r>
-        <w:rPr>
-          <w:rFonts w:ascii="TH SarabunPSK" w:hAnsi="TH SarabunPSK" w:cs="TH SarabunPSK"/>
-          <w:sz w:val="32"/>
-          <w:szCs w:val="32"/>
-          <w:cs/>
-        </w:rPr>
         <w:t xml:space="preserve"> </w:t>
       </w:r>
       <w:r>
@@ -652,7 +712,7 @@
           <w:sz w:val="32"/>
           <w:szCs w:val="32"/>
         </w:rPr>
-        <w:t xml:space="preserve">17 </w:t>
+        <w:t>&amp;</w:t>
       </w:r>
       <w:r>
         <w:rPr>
@@ -661,23 +721,6 @@
           <w:szCs w:val="32"/>
           <w:cs/>
         </w:rPr>
-        <w:t xml:space="preserve">ตุลาคม </w:t>
-      </w:r>
-      <w:r>
-        <w:rPr>
-          <w:rFonts w:ascii="TH SarabunPSK" w:hAnsi="TH SarabunPSK" w:cs="TH SarabunPSK"/>
-          <w:sz w:val="32"/>
-          <w:szCs w:val="32"/>
-        </w:rPr>
-        <w:t>2568</w:t>
-      </w:r>
-      <w:r>
-        <w:rPr>
-          <w:rFonts w:ascii="TH SarabunPSK" w:hAnsi="TH SarabunPSK" w:cs="TH SarabunPSK" w:hint="cs"/>
-          <w:sz w:val="32"/>
-          <w:szCs w:val="32"/>
-          <w:cs/>
-        </w:rPr>
         <w:t xml:space="preserve"> </w:t>
       </w:r>
       <w:r>
@@ -685,51 +728,32 @@
           <w:rFonts w:ascii="TH SarabunPSK" w:hAnsi="TH SarabunPSK" w:cs="TH SarabunPSK"/>
           <w:sz w:val="32"/>
           <w:szCs w:val="32"/>
-          <w:cs/>
-        </w:rPr>
-        <w:t xml:space="preserve">ในตำแหน่ง </w:t>
-      </w:r>
-      <w:r>
-        <w:rPr>
-          <w:rFonts w:ascii="TH SarabunPSK" w:hAnsi="TH SarabunPSK" w:cs="TH SarabunPSK"/>
-          <w:sz w:val="32"/>
-          <w:szCs w:val="32"/>
-        </w:rPr>
-        <w:t>Web developer</w:t>
-      </w:r>
-      <w:r>
-        <w:rPr>
-          <w:rFonts w:ascii="TH SarabunPSK" w:hAnsi="TH SarabunPSK" w:cs="TH SarabunPSK" w:hint="cs"/>
-          <w:sz w:val="32"/>
-          <w:szCs w:val="32"/>
-          <w:cs/>
-        </w:rPr>
-        <w:t xml:space="preserve"> </w:t>
-      </w:r>
-      <w:r>
-        <w:rPr>
-          <w:rFonts w:ascii="TH SarabunPSK" w:hAnsi="TH SarabunPSK" w:cs="TH SarabunPSK"/>
-          <w:sz w:val="32"/>
-          <w:szCs w:val="32"/>
-        </w:rPr>
-        <w:t>&amp;</w:t>
-      </w:r>
-      <w:r>
-        <w:rPr>
-          <w:rFonts w:ascii="TH SarabunPSK" w:hAnsi="TH SarabunPSK" w:cs="TH SarabunPSK" w:hint="cs"/>
-          <w:sz w:val="32"/>
-          <w:szCs w:val="32"/>
-          <w:cs/>
-        </w:rPr>
-        <w:t xml:space="preserve"> </w:t>
-      </w:r>
-      <w:r>
-        <w:rPr>
-          <w:rFonts w:ascii="TH SarabunPSK" w:hAnsi="TH SarabunPSK" w:cs="TH SarabunPSK"/>
-          <w:sz w:val="32"/>
-          <w:szCs w:val="32"/>
-        </w:rPr>
-        <w:t>Full stack</w:t>
+        </w:rPr>
+        <w:t xml:space="preserve">Full </w:t>
+      </w:r>
+      <w:r>
+        <w:rPr>
+          <w:rFonts w:ascii="TH SarabunPSK" w:hAnsi="TH SarabunPSK" w:cs="TH SarabunPSK"/>
+          <w:sz w:val="32"/>
+          <w:szCs w:val="32"/>
+        </w:rPr>
+        <w:t>S</w:t>
+      </w:r>
+      <w:r>
+        <w:rPr>
+          <w:rFonts w:ascii="TH SarabunPSK" w:hAnsi="TH SarabunPSK" w:cs="TH SarabunPSK"/>
+          <w:sz w:val="32"/>
+          <w:szCs w:val="32"/>
+        </w:rPr>
+        <w:t>tack</w:t>
+      </w:r>
+      <w:r>
+        <w:rPr>
+          <w:rFonts w:ascii="TH SarabunPSK" w:hAnsi="TH SarabunPSK" w:cs="TH SarabunPSK"/>
+          <w:sz w:val="32"/>
+          <w:szCs w:val="32"/>
+        </w:rPr>
+        <w:t xml:space="preserve"> Developer</w:t>
       </w:r>
       <w:r>
         <w:rPr>
@@ -790,6 +814,15 @@
       </w:r>
       <w:r>
         <w:rPr>
+          <w:rFonts w:ascii="TH SarabunPSK" w:hAnsi="TH SarabunPSK" w:cs="TH SarabunPSK" w:hint="cs"/>
+          <w:sz w:val="32"/>
+          <w:szCs w:val="32"/>
+          <w:cs/>
+        </w:rPr>
+        <w:t>การพีฒนา</w:t>
+      </w:r>
+      <w:r>
+        <w:rPr>
           <w:rFonts w:ascii="TH SarabunPSK" w:hAnsi="TH SarabunPSK" w:cs="TH SarabunPSK"/>
           <w:sz w:val="32"/>
           <w:szCs w:val="32"/>
@@ -806,7 +839,7 @@
         <w:spacing w:after="0"/>
         <w:jc w:val="thaiDistribute"/>
         <w:rPr>
-          <w:rFonts w:ascii="TH SarabunPSK" w:hAnsi="TH SarabunPSK" w:cs="TH SarabunPSK" w:hint="cs"/>
+          <w:rFonts w:ascii="TH SarabunPSK" w:hAnsi="TH SarabunPSK" w:cs="TH SarabunPSK"/>
           <w:sz w:val="32"/>
           <w:szCs w:val="32"/>
           <w:cs/>
@@ -967,7 +1000,7 @@
       <w:pPr>
         <w:tabs>
           <w:tab w:val="left" w:pos="2987"/>
-          <w:tab w:val="left" w:pos="4253"/>
+          <w:tab w:val="left" w:pos="4111"/>
         </w:tabs>
         <w:spacing w:after="0"/>
         <w:jc w:val="thaiDistribute"/>
@@ -1091,16 +1124,7 @@
           <w:szCs w:val="32"/>
           <w:cs/>
         </w:rPr>
-        <w:t>นาย</w:t>
-      </w:r>
-      <w:r>
-        <w:rPr>
-          <w:rFonts w:ascii="TH SarabunPSK" w:hAnsi="TH SarabunPSK" w:cs="TH SarabunPSK" w:hint="cs"/>
-          <w:sz w:val="32"/>
-          <w:szCs w:val="32"/>
-          <w:cs/>
-        </w:rPr>
-        <w:t>นายวัชรินทร์ สายนันท์</w:t>
+        <w:t>นายนายวัชรินทร์ สายนันท์</w:t>
       </w:r>
       <w:r>
         <w:rPr>
@@ -1400,17 +1424,6 @@
         <w:jc w:val="center"/>
         <w:rPr>
           <w:rFonts w:ascii="TH SarabunPSK" w:hAnsi="TH SarabunPSK" w:cs="TH SarabunPSK"/>
-          <w:sz w:val="32"/>
-          <w:szCs w:val="32"/>
-        </w:rPr>
-      </w:pPr>
-    </w:p>
-    <w:p>
-      <w:pPr>
-        <w:spacing w:after="0"/>
-        <w:jc w:val="right"/>
-        <w:rPr>
-          <w:rFonts w:ascii="TH SarabunPSK" w:hAnsi="TH SarabunPSK" w:cs="TH SarabunPSK" w:hint="cs"/>
           <w:sz w:val="32"/>
           <w:szCs w:val="32"/>
         </w:rPr>
@@ -1442,7 +1455,7 @@
 </file>
 
 <file path=word/endnotes.xml><?xml version="1.0" encoding="utf-8"?>
-<w:endnotes xmlns:wpc="http://schemas.microsoft.com/office/word/2010/wordprocessingCanvas" xmlns:cx="http://schemas.microsoft.com/office/drawing/2014/chartex" xmlns:cx1="http://schemas.microsoft.com/office/drawing/2015/9/8/chartex" xmlns:cx2="http://schemas.microsoft.com/office/drawing/2015/10/21/chartex" xmlns:cx3="http://schemas.microsoft.com/office/drawing/2016/5/9/chartex" xmlns:cx4="http://schemas.microsoft.com/office/drawing/2016/5/10/chartex" xmlns:cx5="http://schemas.microsoft.com/office/drawing/2016/5/11/chartex" xmlns:cx6="http://schemas.microsoft.com/office/drawing/2016/5/12/chartex" xmlns:cx7="http://schemas.microsoft.com/office/drawing/2016/5/13/chartex" xmlns:cx8="http://schemas.microsoft.com/office/drawing/2016/5/14/chartex" xmlns:mc="http://schemas.openxmlformats.org/markup-compatibility/2006" xmlns:aink="http://schemas.microsoft.com/office/drawing/2016/ink" xmlns:am3d="http://schemas.microsoft.com/office/drawing/2017/model3d" xmlns:o="urn:schemas-microsoft-com:office:office" xmlns:oel="http://schemas.microsoft.com/office/2019/extlst" xmlns:r="http://schemas.openxmlformats.org/officeDocument/2006/relationships" xmlns:m="http://schemas.openxmlformats.org/officeDocument/2006/math" xmlns:v="urn:schemas-microsoft-com:vml" xmlns:wp14="http://schemas.microsoft.com/office/word/2010/wordprocessingDrawing" xmlns:wp="http://schemas.openxmlformats.org/drawingml/2006/wordprocessingDrawing" xmlns:w10="urn:schemas-microsoft-com:office:word" xmlns:w="http://schemas.openxmlformats.org/wordprocessingml/2006/main" xmlns:w14="http://schemas.microsoft.com/office/word/2010/wordml" xmlns:w15="http://schemas.microsoft.com/office/word/2012/wordml" xmlns:w16cex="http://schemas.microsoft.com/office/word/2018/wordml/cex" xmlns:w16cid="http://schemas.microsoft.com/office/word/2016/wordml/cid" xmlns:w16="http://schemas.microsoft.com/office/word/2018/wordml" xmlns:w16du="http://schemas.microsoft.com/office/word/2023/wordml/word16du" xmlns:w16sdtdh="http://schemas.microsoft.com/office/word/2020/wordml/sdtdatahash" xmlns:w16sdtfl="http://schemas.microsoft.com/office/word/2024/wordml/sdtformatlock" xmlns:w16se="http://schemas.microsoft.com/office/word/2015/wordml/symex" xmlns:wpg="http://schemas.microsoft.com/office/word/2010/wordprocessingGroup" xmlns:wpi="http://schemas.microsoft.com/office/word/2010/wordprocessingInk" xmlns:wne="http://schemas.microsoft.com/office/word/2006/wordml" xmlns:wps="http://schemas.microsoft.com/office/word/2010/wordprocessingShape" mc:Ignorable="w14 w15 w16se w16cid w16 w16cex w16sdtdh w16sdtfl w16du wp14">
+<w:endnotes xmlns:wpc="http://schemas.microsoft.com/office/word/2010/wordprocessingCanvas" xmlns:cx="http://schemas.microsoft.com/office/drawing/2014/chartex" xmlns:cx1="http://schemas.microsoft.com/office/drawing/2015/9/8/chartex" xmlns:cx2="http://schemas.microsoft.com/office/drawing/2015/10/21/chartex" xmlns:cx3="http://schemas.microsoft.com/office/drawing/2016/5/9/chartex" xmlns:cx4="http://schemas.microsoft.com/office/drawing/2016/5/10/chartex" xmlns:cx5="http://schemas.microsoft.com/office/drawing/2016/5/11/chartex" xmlns:cx6="http://schemas.microsoft.com/office/drawing/2016/5/12/chartex" xmlns:cx7="http://schemas.microsoft.com/office/drawing/2016/5/13/chartex" xmlns:cx8="http://schemas.microsoft.com/office/drawing/2016/5/14/chartex" xmlns:mc="http://schemas.openxmlformats.org/markup-compatibility/2006" xmlns:aink="http://schemas.microsoft.com/office/drawing/2016/ink" xmlns:am3d="http://schemas.microsoft.com/office/drawing/2017/model3d" xmlns:o="urn:schemas-microsoft-com:office:office" xmlns:r="http://schemas.openxmlformats.org/officeDocument/2006/relationships" xmlns:m="http://schemas.openxmlformats.org/officeDocument/2006/math" xmlns:v="urn:schemas-microsoft-com:vml" xmlns:wp14="http://schemas.microsoft.com/office/word/2010/wordprocessingDrawing" xmlns:wp="http://schemas.openxmlformats.org/drawingml/2006/wordprocessingDrawing" xmlns:w10="urn:schemas-microsoft-com:office:word" xmlns:w="http://schemas.openxmlformats.org/wordprocessingml/2006/main" xmlns:w14="http://schemas.microsoft.com/office/word/2010/wordml" xmlns:w15="http://schemas.microsoft.com/office/word/2012/wordml" xmlns:w16cex="http://schemas.microsoft.com/office/word/2018/wordml/cex" xmlns:w16cid="http://schemas.microsoft.com/office/word/2016/wordml/cid" xmlns:w16="http://schemas.microsoft.com/office/word/2018/wordml" xmlns:w16sdtdh="http://schemas.microsoft.com/office/word/2020/wordml/sdtdatahash" xmlns:w16se="http://schemas.microsoft.com/office/word/2015/wordml/symex" xmlns:wpg="http://schemas.microsoft.com/office/word/2010/wordprocessingGroup" xmlns:wpi="http://schemas.microsoft.com/office/word/2010/wordprocessingInk" xmlns:wne="http://schemas.microsoft.com/office/word/2006/wordml" xmlns:wps="http://schemas.microsoft.com/office/word/2010/wordprocessingShape" mc:Ignorable="w14 w15 w16se w16cid w16 w16cex w16sdtdh wp14">
   <w:endnote w:type="separator" w:id="-1">
     <w:p>
       <w:pPr>
@@ -1467,7 +1480,7 @@
 </file>
 
 <file path=word/footer1.xml><?xml version="1.0" encoding="utf-8"?>
-<w:ftr xmlns:wpc="http://schemas.microsoft.com/office/word/2010/wordprocessingCanvas" xmlns:cx="http://schemas.microsoft.com/office/drawing/2014/chartex" xmlns:cx1="http://schemas.microsoft.com/office/drawing/2015/9/8/chartex" xmlns:cx2="http://schemas.microsoft.com/office/drawing/2015/10/21/chartex" xmlns:cx3="http://schemas.microsoft.com/office/drawing/2016/5/9/chartex" xmlns:cx4="http://schemas.microsoft.com/office/drawing/2016/5/10/chartex" xmlns:cx5="http://schemas.microsoft.com/office/drawing/2016/5/11/chartex" xmlns:cx6="http://schemas.microsoft.com/office/drawing/2016/5/12/chartex" xmlns:cx7="http://schemas.microsoft.com/office/drawing/2016/5/13/chartex" xmlns:cx8="http://schemas.microsoft.com/office/drawing/2016/5/14/chartex" xmlns:mc="http://schemas.openxmlformats.org/markup-compatibility/2006" xmlns:aink="http://schemas.microsoft.com/office/drawing/2016/ink" xmlns:am3d="http://schemas.microsoft.com/office/drawing/2017/model3d" xmlns:o="urn:schemas-microsoft-com:office:office" xmlns:oel="http://schemas.microsoft.com/office/2019/extlst" xmlns:r="http://schemas.openxmlformats.org/officeDocument/2006/relationships" xmlns:m="http://schemas.openxmlformats.org/officeDocument/2006/math" xmlns:v="urn:schemas-microsoft-com:vml" xmlns:wp14="http://schemas.microsoft.com/office/word/2010/wordprocessingDrawing" xmlns:wp="http://schemas.openxmlformats.org/drawingml/2006/wordprocessingDrawing" xmlns:w10="urn:schemas-microsoft-com:office:word" xmlns:w="http://schemas.openxmlformats.org/wordprocessingml/2006/main" xmlns:w14="http://schemas.microsoft.com/office/word/2010/wordml" xmlns:w15="http://schemas.microsoft.com/office/word/2012/wordml" xmlns:w16cex="http://schemas.microsoft.com/office/word/2018/wordml/cex" xmlns:w16cid="http://schemas.microsoft.com/office/word/2016/wordml/cid" xmlns:w16="http://schemas.microsoft.com/office/word/2018/wordml" xmlns:w16du="http://schemas.microsoft.com/office/word/2023/wordml/word16du" xmlns:w16sdtdh="http://schemas.microsoft.com/office/word/2020/wordml/sdtdatahash" xmlns:w16sdtfl="http://schemas.microsoft.com/office/word/2024/wordml/sdtformatlock" xmlns:w16se="http://schemas.microsoft.com/office/word/2015/wordml/symex" xmlns:wpg="http://schemas.microsoft.com/office/word/2010/wordprocessingGroup" xmlns:wpi="http://schemas.microsoft.com/office/word/2010/wordprocessingInk" xmlns:wne="http://schemas.microsoft.com/office/word/2006/wordml" xmlns:wps="http://schemas.microsoft.com/office/word/2010/wordprocessingShape" mc:Ignorable="w14 w15 w16se w16cid w16 w16cex w16sdtdh w16sdtfl w16du wp14">
+<w:ftr xmlns:wpc="http://schemas.microsoft.com/office/word/2010/wordprocessingCanvas" xmlns:cx="http://schemas.microsoft.com/office/drawing/2014/chartex" xmlns:cx1="http://schemas.microsoft.com/office/drawing/2015/9/8/chartex" xmlns:cx2="http://schemas.microsoft.com/office/drawing/2015/10/21/chartex" xmlns:cx3="http://schemas.microsoft.com/office/drawing/2016/5/9/chartex" xmlns:cx4="http://schemas.microsoft.com/office/drawing/2016/5/10/chartex" xmlns:cx5="http://schemas.microsoft.com/office/drawing/2016/5/11/chartex" xmlns:cx6="http://schemas.microsoft.com/office/drawing/2016/5/12/chartex" xmlns:cx7="http://schemas.microsoft.com/office/drawing/2016/5/13/chartex" xmlns:cx8="http://schemas.microsoft.com/office/drawing/2016/5/14/chartex" xmlns:mc="http://schemas.openxmlformats.org/markup-compatibility/2006" xmlns:aink="http://schemas.microsoft.com/office/drawing/2016/ink" xmlns:am3d="http://schemas.microsoft.com/office/drawing/2017/model3d" xmlns:o="urn:schemas-microsoft-com:office:office" xmlns:r="http://schemas.openxmlformats.org/officeDocument/2006/relationships" xmlns:m="http://schemas.openxmlformats.org/officeDocument/2006/math" xmlns:v="urn:schemas-microsoft-com:vml" xmlns:wp14="http://schemas.microsoft.com/office/word/2010/wordprocessingDrawing" xmlns:wp="http://schemas.openxmlformats.org/drawingml/2006/wordprocessingDrawing" xmlns:w10="urn:schemas-microsoft-com:office:word" xmlns:w="http://schemas.openxmlformats.org/wordprocessingml/2006/main" xmlns:w14="http://schemas.microsoft.com/office/word/2010/wordml" xmlns:w15="http://schemas.microsoft.com/office/word/2012/wordml" xmlns:w16cex="http://schemas.microsoft.com/office/word/2018/wordml/cex" xmlns:w16cid="http://schemas.microsoft.com/office/word/2016/wordml/cid" xmlns:w16="http://schemas.microsoft.com/office/word/2018/wordml" xmlns:w16sdtdh="http://schemas.microsoft.com/office/word/2020/wordml/sdtdatahash" xmlns:w16se="http://schemas.microsoft.com/office/word/2015/wordml/symex" xmlns:wpg="http://schemas.microsoft.com/office/word/2010/wordprocessingGroup" xmlns:wpi="http://schemas.microsoft.com/office/word/2010/wordprocessingInk" xmlns:wne="http://schemas.microsoft.com/office/word/2006/wordml" xmlns:wps="http://schemas.microsoft.com/office/word/2010/wordprocessingShape" mc:Ignorable="w14 w15 w16se w16cid w16 w16cex w16sdtdh wp14">
   <w:sdt>
     <w:sdtPr>
       <w:id w:val="-1367829525"/>
@@ -1486,7 +1499,7 @@
     <w:sdtContent>
       <w:p>
         <w:pPr>
-          <w:pStyle w:val="a6"/>
+          <w:pStyle w:val="Footer"/>
           <w:jc w:val="center"/>
           <w:rPr>
             <w:rFonts w:ascii="TH SarabunPSK" w:hAnsi="TH SarabunPSK" w:cs="TH SarabunPSK"/>
@@ -1543,7 +1556,7 @@
 </file>
 
 <file path=word/footnotes.xml><?xml version="1.0" encoding="utf-8"?>
-<w:footnotes xmlns:wpc="http://schemas.microsoft.com/office/word/2010/wordprocessingCanvas" xmlns:cx="http://schemas.microsoft.com/office/drawing/2014/chartex" xmlns:cx1="http://schemas.microsoft.com/office/drawing/2015/9/8/chartex" xmlns:cx2="http://schemas.microsoft.com/office/drawing/2015/10/21/chartex" xmlns:cx3="http://schemas.microsoft.com/office/drawing/2016/5/9/chartex" xmlns:cx4="http://schemas.microsoft.com/office/drawing/2016/5/10/chartex" xmlns:cx5="http://schemas.microsoft.com/office/drawing/2016/5/11/chartex" xmlns:cx6="http://schemas.microsoft.com/office/drawing/2016/5/12/chartex" xmlns:cx7="http://schemas.microsoft.com/office/drawing/2016/5/13/chartex" xmlns:cx8="http://schemas.microsoft.com/office/drawing/2016/5/14/chartex" xmlns:mc="http://schemas.openxmlformats.org/markup-compatibility/2006" xmlns:aink="http://schemas.microsoft.com/office/drawing/2016/ink" xmlns:am3d="http://schemas.microsoft.com/office/drawing/2017/model3d" xmlns:o="urn:schemas-microsoft-com:office:office" xmlns:oel="http://schemas.microsoft.com/office/2019/extlst" xmlns:r="http://schemas.openxmlformats.org/officeDocument/2006/relationships" xmlns:m="http://schemas.openxmlformats.org/officeDocument/2006/math" xmlns:v="urn:schemas-microsoft-com:vml" xmlns:wp14="http://schemas.microsoft.com/office/word/2010/wordprocessingDrawing" xmlns:wp="http://schemas.openxmlformats.org/drawingml/2006/wordprocessingDrawing" xmlns:w10="urn:schemas-microsoft-com:office:word" xmlns:w="http://schemas.openxmlformats.org/wordprocessingml/2006/main" xmlns:w14="http://schemas.microsoft.com/office/word/2010/wordml" xmlns:w15="http://schemas.microsoft.com/office/word/2012/wordml" xmlns:w16cex="http://schemas.microsoft.com/office/word/2018/wordml/cex" xmlns:w16cid="http://schemas.microsoft.com/office/word/2016/wordml/cid" xmlns:w16="http://schemas.microsoft.com/office/word/2018/wordml" xmlns:w16du="http://schemas.microsoft.com/office/word/2023/wordml/word16du" xmlns:w16sdtdh="http://schemas.microsoft.com/office/word/2020/wordml/sdtdatahash" xmlns:w16sdtfl="http://schemas.microsoft.com/office/word/2024/wordml/sdtformatlock" xmlns:w16se="http://schemas.microsoft.com/office/word/2015/wordml/symex" xmlns:wpg="http://schemas.microsoft.com/office/word/2010/wordprocessingGroup" xmlns:wpi="http://schemas.microsoft.com/office/word/2010/wordprocessingInk" xmlns:wne="http://schemas.microsoft.com/office/word/2006/wordml" xmlns:wps="http://schemas.microsoft.com/office/word/2010/wordprocessingShape" mc:Ignorable="w14 w15 w16se w16cid w16 w16cex w16sdtdh w16sdtfl w16du wp14">
+<w:footnotes xmlns:wpc="http://schemas.microsoft.com/office/word/2010/wordprocessingCanvas" xmlns:cx="http://schemas.microsoft.com/office/drawing/2014/chartex" xmlns:cx1="http://schemas.microsoft.com/office/drawing/2015/9/8/chartex" xmlns:cx2="http://schemas.microsoft.com/office/drawing/2015/10/21/chartex" xmlns:cx3="http://schemas.microsoft.com/office/drawing/2016/5/9/chartex" xmlns:cx4="http://schemas.microsoft.com/office/drawing/2016/5/10/chartex" xmlns:cx5="http://schemas.microsoft.com/office/drawing/2016/5/11/chartex" xmlns:cx6="http://schemas.microsoft.com/office/drawing/2016/5/12/chartex" xmlns:cx7="http://schemas.microsoft.com/office/drawing/2016/5/13/chartex" xmlns:cx8="http://schemas.microsoft.com/office/drawing/2016/5/14/chartex" xmlns:mc="http://schemas.openxmlformats.org/markup-compatibility/2006" xmlns:aink="http://schemas.microsoft.com/office/drawing/2016/ink" xmlns:am3d="http://schemas.microsoft.com/office/drawing/2017/model3d" xmlns:o="urn:schemas-microsoft-com:office:office" xmlns:r="http://schemas.openxmlformats.org/officeDocument/2006/relationships" xmlns:m="http://schemas.openxmlformats.org/officeDocument/2006/math" xmlns:v="urn:schemas-microsoft-com:vml" xmlns:wp14="http://schemas.microsoft.com/office/word/2010/wordprocessingDrawing" xmlns:wp="http://schemas.openxmlformats.org/drawingml/2006/wordprocessingDrawing" xmlns:w10="urn:schemas-microsoft-com:office:word" xmlns:w="http://schemas.openxmlformats.org/wordprocessingml/2006/main" xmlns:w14="http://schemas.microsoft.com/office/word/2010/wordml" xmlns:w15="http://schemas.microsoft.com/office/word/2012/wordml" xmlns:w16cex="http://schemas.microsoft.com/office/word/2018/wordml/cex" xmlns:w16cid="http://schemas.microsoft.com/office/word/2016/wordml/cid" xmlns:w16="http://schemas.microsoft.com/office/word/2018/wordml" xmlns:w16sdtdh="http://schemas.microsoft.com/office/word/2020/wordml/sdtdatahash" xmlns:w16se="http://schemas.microsoft.com/office/word/2015/wordml/symex" xmlns:wpg="http://schemas.microsoft.com/office/word/2010/wordprocessingGroup" xmlns:wpi="http://schemas.microsoft.com/office/word/2010/wordprocessingInk" xmlns:wne="http://schemas.microsoft.com/office/word/2006/wordml" xmlns:wps="http://schemas.microsoft.com/office/word/2010/wordprocessingShape" mc:Ignorable="w14 w15 w16se w16cid w16 w16cex w16sdtdh wp14">
   <w:footnote w:type="separator" w:id="-1">
     <w:p>
       <w:pPr>
@@ -1568,7 +1581,7 @@
 </file>
 
 <file path=word/numbering.xml><?xml version="1.0" encoding="utf-8"?>
-<w:numbering xmlns:wpc="http://schemas.microsoft.com/office/word/2010/wordprocessingCanvas" xmlns:cx="http://schemas.microsoft.com/office/drawing/2014/chartex" xmlns:cx1="http://schemas.microsoft.com/office/drawing/2015/9/8/chartex" xmlns:cx2="http://schemas.microsoft.com/office/drawing/2015/10/21/chartex" xmlns:cx3="http://schemas.microsoft.com/office/drawing/2016/5/9/chartex" xmlns:cx4="http://schemas.microsoft.com/office/drawing/2016/5/10/chartex" xmlns:cx5="http://schemas.microsoft.com/office/drawing/2016/5/11/chartex" xmlns:cx6="http://schemas.microsoft.com/office/drawing/2016/5/12/chartex" xmlns:cx7="http://schemas.microsoft.com/office/drawing/2016/5/13/chartex" xmlns:cx8="http://schemas.microsoft.com/office/drawing/2016/5/14/chartex" xmlns:mc="http://schemas.openxmlformats.org/markup-compatibility/2006" xmlns:aink="http://schemas.microsoft.com/office/drawing/2016/ink" xmlns:am3d="http://schemas.microsoft.com/office/drawing/2017/model3d" xmlns:o="urn:schemas-microsoft-com:office:office" xmlns:oel="http://schemas.microsoft.com/office/2019/extlst" xmlns:r="http://schemas.openxmlformats.org/officeDocument/2006/relationships" xmlns:m="http://schemas.openxmlformats.org/officeDocument/2006/math" xmlns:v="urn:schemas-microsoft-com:vml" xmlns:wp14="http://schemas.microsoft.com/office/word/2010/wordprocessingDrawing" xmlns:wp="http://schemas.openxmlformats.org/drawingml/2006/wordprocessingDrawing" xmlns:w10="urn:schemas-microsoft-com:office:word" xmlns:w="http://schemas.openxmlformats.org/wordprocessingml/2006/main" xmlns:w14="http://schemas.microsoft.com/office/word/2010/wordml" xmlns:w15="http://schemas.microsoft.com/office/word/2012/wordml" xmlns:w16cex="http://schemas.microsoft.com/office/word/2018/wordml/cex" xmlns:w16cid="http://schemas.microsoft.com/office/word/2016/wordml/cid" xmlns:w16="http://schemas.microsoft.com/office/word/2018/wordml" xmlns:w16du="http://schemas.microsoft.com/office/word/2023/wordml/word16du" xmlns:w16sdtdh="http://schemas.microsoft.com/office/word/2020/wordml/sdtdatahash" xmlns:w16sdtfl="http://schemas.microsoft.com/office/word/2024/wordml/sdtformatlock" xmlns:w16se="http://schemas.microsoft.com/office/word/2015/wordml/symex" xmlns:wpg="http://schemas.microsoft.com/office/word/2010/wordprocessingGroup" xmlns:wpi="http://schemas.microsoft.com/office/word/2010/wordprocessingInk" xmlns:wne="http://schemas.microsoft.com/office/word/2006/wordml" xmlns:wps="http://schemas.microsoft.com/office/word/2010/wordprocessingShape" mc:Ignorable="w14 w15 w16se w16cid w16 w16cex w16sdtdh w16sdtfl w16du wp14">
+<w:numbering xmlns:wpc="http://schemas.microsoft.com/office/word/2010/wordprocessingCanvas" xmlns:cx="http://schemas.microsoft.com/office/drawing/2014/chartex" xmlns:cx1="http://schemas.microsoft.com/office/drawing/2015/9/8/chartex" xmlns:cx2="http://schemas.microsoft.com/office/drawing/2015/10/21/chartex" xmlns:cx3="http://schemas.microsoft.com/office/drawing/2016/5/9/chartex" xmlns:cx4="http://schemas.microsoft.com/office/drawing/2016/5/10/chartex" xmlns:cx5="http://schemas.microsoft.com/office/drawing/2016/5/11/chartex" xmlns:cx6="http://schemas.microsoft.com/office/drawing/2016/5/12/chartex" xmlns:cx7="http://schemas.microsoft.com/office/drawing/2016/5/13/chartex" xmlns:cx8="http://schemas.microsoft.com/office/drawing/2016/5/14/chartex" xmlns:mc="http://schemas.openxmlformats.org/markup-compatibility/2006" xmlns:aink="http://schemas.microsoft.com/office/drawing/2016/ink" xmlns:am3d="http://schemas.microsoft.com/office/drawing/2017/model3d" xmlns:o="urn:schemas-microsoft-com:office:office" xmlns:r="http://schemas.openxmlformats.org/officeDocument/2006/relationships" xmlns:m="http://schemas.openxmlformats.org/officeDocument/2006/math" xmlns:v="urn:schemas-microsoft-com:vml" xmlns:wp14="http://schemas.microsoft.com/office/word/2010/wordprocessingDrawing" xmlns:wp="http://schemas.openxmlformats.org/drawingml/2006/wordprocessingDrawing" xmlns:w10="urn:schemas-microsoft-com:office:word" xmlns:w="http://schemas.openxmlformats.org/wordprocessingml/2006/main" xmlns:w14="http://schemas.microsoft.com/office/word/2010/wordml" xmlns:w15="http://schemas.microsoft.com/office/word/2012/wordml" xmlns:w16cex="http://schemas.microsoft.com/office/word/2018/wordml/cex" xmlns:w16cid="http://schemas.microsoft.com/office/word/2016/wordml/cid" xmlns:w16="http://schemas.microsoft.com/office/word/2018/wordml" xmlns:w16sdtdh="http://schemas.microsoft.com/office/word/2020/wordml/sdtdatahash" xmlns:w16se="http://schemas.microsoft.com/office/word/2015/wordml/symex" xmlns:wpg="http://schemas.microsoft.com/office/word/2010/wordprocessingGroup" xmlns:wpi="http://schemas.microsoft.com/office/word/2010/wordprocessingInk" xmlns:wne="http://schemas.microsoft.com/office/word/2006/wordml" xmlns:wps="http://schemas.microsoft.com/office/word/2010/wordprocessingShape" mc:Ignorable="w14 w15 w16se w16cid w16 w16cex w16sdtdh wp14">
   <w:abstractNum w:abstractNumId="0" w15:restartNumberingAfterBreak="0">
     <w:nsid w:val="00E457BC"/>
     <w:multiLevelType w:val="hybridMultilevel"/>
@@ -3275,62 +3288,62 @@
       </w:pPr>
     </w:lvl>
   </w:abstractNum>
-  <w:num w:numId="1" w16cid:durableId="1583906446">
+  <w:num w:numId="1">
     <w:abstractNumId w:val="0"/>
   </w:num>
-  <w:num w:numId="2" w16cid:durableId="985860999">
+  <w:num w:numId="2">
     <w:abstractNumId w:val="10"/>
   </w:num>
-  <w:num w:numId="3" w16cid:durableId="488641949">
+  <w:num w:numId="3">
     <w:abstractNumId w:val="1"/>
   </w:num>
-  <w:num w:numId="4" w16cid:durableId="450561674">
+  <w:num w:numId="4">
     <w:abstractNumId w:val="5"/>
   </w:num>
-  <w:num w:numId="5" w16cid:durableId="1768576195">
+  <w:num w:numId="5">
     <w:abstractNumId w:val="16"/>
   </w:num>
-  <w:num w:numId="6" w16cid:durableId="1742168016">
+  <w:num w:numId="6">
     <w:abstractNumId w:val="11"/>
   </w:num>
-  <w:num w:numId="7" w16cid:durableId="1815636657">
+  <w:num w:numId="7">
     <w:abstractNumId w:val="12"/>
   </w:num>
-  <w:num w:numId="8" w16cid:durableId="1011764660">
+  <w:num w:numId="8">
     <w:abstractNumId w:val="6"/>
   </w:num>
-  <w:num w:numId="9" w16cid:durableId="477768523">
+  <w:num w:numId="9">
     <w:abstractNumId w:val="3"/>
   </w:num>
-  <w:num w:numId="10" w16cid:durableId="1089427786">
+  <w:num w:numId="10">
     <w:abstractNumId w:val="8"/>
   </w:num>
-  <w:num w:numId="11" w16cid:durableId="861818649">
+  <w:num w:numId="11">
     <w:abstractNumId w:val="9"/>
   </w:num>
-  <w:num w:numId="12" w16cid:durableId="526603693">
+  <w:num w:numId="12">
     <w:abstractNumId w:val="15"/>
   </w:num>
-  <w:num w:numId="13" w16cid:durableId="82919836">
+  <w:num w:numId="13">
     <w:abstractNumId w:val="7"/>
   </w:num>
-  <w:num w:numId="14" w16cid:durableId="1145009322">
+  <w:num w:numId="14">
     <w:abstractNumId w:val="14"/>
   </w:num>
-  <w:num w:numId="15" w16cid:durableId="635794765">
+  <w:num w:numId="15">
     <w:abstractNumId w:val="4"/>
   </w:num>
-  <w:num w:numId="16" w16cid:durableId="1102799571">
+  <w:num w:numId="16">
     <w:abstractNumId w:val="13"/>
   </w:num>
-  <w:num w:numId="17" w16cid:durableId="1978752247">
+  <w:num w:numId="17">
     <w:abstractNumId w:val="2"/>
   </w:num>
 </w:numbering>
 </file>
 
 <file path=word/styles.xml><?xml version="1.0" encoding="utf-8"?>
-<w:styles xmlns:mc="http://schemas.openxmlformats.org/markup-compatibility/2006" xmlns:r="http://schemas.openxmlformats.org/officeDocument/2006/relationships" xmlns:w="http://schemas.openxmlformats.org/wordprocessingml/2006/main" xmlns:w14="http://schemas.microsoft.com/office/word/2010/wordml" xmlns:w15="http://schemas.microsoft.com/office/word/2012/wordml" xmlns:w16cex="http://schemas.microsoft.com/office/word/2018/wordml/cex" xmlns:w16cid="http://schemas.microsoft.com/office/word/2016/wordml/cid" xmlns:w16="http://schemas.microsoft.com/office/word/2018/wordml" xmlns:w16du="http://schemas.microsoft.com/office/word/2023/wordml/word16du" xmlns:w16sdtdh="http://schemas.microsoft.com/office/word/2020/wordml/sdtdatahash" xmlns:w16sdtfl="http://schemas.microsoft.com/office/word/2024/wordml/sdtformatlock" xmlns:w16se="http://schemas.microsoft.com/office/word/2015/wordml/symex" mc:Ignorable="w14 w15 w16se w16cid w16 w16cex w16sdtdh w16sdtfl w16du">
+<w:styles xmlns:mc="http://schemas.openxmlformats.org/markup-compatibility/2006" xmlns:r="http://schemas.openxmlformats.org/officeDocument/2006/relationships" xmlns:w="http://schemas.openxmlformats.org/wordprocessingml/2006/main" xmlns:w14="http://schemas.microsoft.com/office/word/2010/wordml" xmlns:w15="http://schemas.microsoft.com/office/word/2012/wordml" xmlns:w16cex="http://schemas.microsoft.com/office/word/2018/wordml/cex" xmlns:w16cid="http://schemas.microsoft.com/office/word/2016/wordml/cid" xmlns:w16="http://schemas.microsoft.com/office/word/2018/wordml" xmlns:w16sdtdh="http://schemas.microsoft.com/office/word/2020/wordml/sdtdatahash" xmlns:w16se="http://schemas.microsoft.com/office/word/2015/wordml/symex" mc:Ignorable="w14 w15 w16se w16cid w16 w16cex w16sdtdh">
   <w:docDefaults>
     <w:rPrDefault>
       <w:rPr>
@@ -3724,17 +3737,17 @@
     <w:lsdException w:name="Unresolved Mention" w:semiHidden="1" w:unhideWhenUsed="1"/>
     <w:lsdException w:name="Smart Link" w:semiHidden="1" w:unhideWhenUsed="1"/>
   </w:latentStyles>
-  <w:style w:type="paragraph" w:default="1" w:styleId="a">
+  <w:style w:type="paragraph" w:default="1" w:styleId="Normal">
     <w:name w:val="Normal"/>
     <w:qFormat/>
   </w:style>
-  <w:style w:type="character" w:default="1" w:styleId="a0">
+  <w:style w:type="character" w:default="1" w:styleId="DefaultParagraphFont">
     <w:name w:val="Default Paragraph Font"/>
     <w:uiPriority w:val="1"/>
     <w:semiHidden/>
     <w:unhideWhenUsed/>
   </w:style>
-  <w:style w:type="table" w:default="1" w:styleId="a1">
+  <w:style w:type="table" w:default="1" w:styleId="TableNormal">
     <w:name w:val="Normal Table"/>
     <w:uiPriority w:val="99"/>
     <w:semiHidden/>
@@ -3749,15 +3762,15 @@
       </w:tblCellMar>
     </w:tblPr>
   </w:style>
-  <w:style w:type="numbering" w:default="1" w:styleId="a2">
+  <w:style w:type="numbering" w:default="1" w:styleId="NoList">
     <w:name w:val="No List"/>
     <w:uiPriority w:val="99"/>
     <w:semiHidden/>
     <w:unhideWhenUsed/>
   </w:style>
-  <w:style w:type="paragraph" w:styleId="a3">
+  <w:style w:type="paragraph" w:styleId="ListParagraph">
     <w:name w:val="List Paragraph"/>
-    <w:basedOn w:val="a"/>
+    <w:basedOn w:val="Normal"/>
     <w:uiPriority w:val="34"/>
     <w:qFormat/>
     <w:rsid w:val="00EF0D9C"/>
@@ -3766,10 +3779,10 @@
       <w:contextualSpacing/>
     </w:pPr>
   </w:style>
-  <w:style w:type="paragraph" w:styleId="a4">
+  <w:style w:type="paragraph" w:styleId="Header">
     <w:name w:val="header"/>
-    <w:basedOn w:val="a"/>
-    <w:link w:val="a5"/>
+    <w:basedOn w:val="Normal"/>
+    <w:link w:val="HeaderChar"/>
     <w:uiPriority w:val="99"/>
     <w:unhideWhenUsed/>
     <w:rsid w:val="00A326F6"/>
@@ -3781,17 +3794,17 @@
       <w:spacing w:after="0" w:line="240" w:lineRule="auto"/>
     </w:pPr>
   </w:style>
-  <w:style w:type="character" w:customStyle="1" w:styleId="a5">
-    <w:name w:val="หัวกระดาษ อักขระ"/>
-    <w:basedOn w:val="a0"/>
-    <w:link w:val="a4"/>
+  <w:style w:type="character" w:customStyle="1" w:styleId="HeaderChar">
+    <w:name w:val="Header Char"/>
+    <w:basedOn w:val="DefaultParagraphFont"/>
+    <w:link w:val="Header"/>
     <w:uiPriority w:val="99"/>
     <w:rsid w:val="00A326F6"/>
   </w:style>
-  <w:style w:type="paragraph" w:styleId="a6">
+  <w:style w:type="paragraph" w:styleId="Footer">
     <w:name w:val="footer"/>
-    <w:basedOn w:val="a"/>
-    <w:link w:val="a7"/>
+    <w:basedOn w:val="Normal"/>
+    <w:link w:val="FooterChar"/>
     <w:uiPriority w:val="99"/>
     <w:unhideWhenUsed/>
     <w:rsid w:val="00A326F6"/>
@@ -3803,17 +3816,17 @@
       <w:spacing w:after="0" w:line="240" w:lineRule="auto"/>
     </w:pPr>
   </w:style>
-  <w:style w:type="character" w:customStyle="1" w:styleId="a7">
-    <w:name w:val="ท้ายกระดาษ อักขระ"/>
-    <w:basedOn w:val="a0"/>
-    <w:link w:val="a6"/>
+  <w:style w:type="character" w:customStyle="1" w:styleId="FooterChar">
+    <w:name w:val="Footer Char"/>
+    <w:basedOn w:val="DefaultParagraphFont"/>
+    <w:link w:val="Footer"/>
     <w:uiPriority w:val="99"/>
     <w:rsid w:val="00A326F6"/>
   </w:style>
-  <w:style w:type="paragraph" w:styleId="a8">
+  <w:style w:type="paragraph" w:styleId="BalloonText">
     <w:name w:val="Balloon Text"/>
-    <w:basedOn w:val="a"/>
-    <w:link w:val="a9"/>
+    <w:basedOn w:val="Normal"/>
+    <w:link w:val="BalloonTextChar"/>
     <w:uiPriority w:val="99"/>
     <w:semiHidden/>
     <w:unhideWhenUsed/>
@@ -3827,10 +3840,10 @@
       <w:szCs w:val="20"/>
     </w:rPr>
   </w:style>
-  <w:style w:type="character" w:customStyle="1" w:styleId="a9">
-    <w:name w:val="ข้อความบอลลูน อักขระ"/>
-    <w:basedOn w:val="a0"/>
-    <w:link w:val="a8"/>
+  <w:style w:type="character" w:customStyle="1" w:styleId="BalloonTextChar">
+    <w:name w:val="Balloon Text Char"/>
+    <w:basedOn w:val="DefaultParagraphFont"/>
+    <w:link w:val="BalloonText"/>
     <w:uiPriority w:val="99"/>
     <w:semiHidden/>
     <w:rsid w:val="006B274B"/>
@@ -3840,9 +3853,9 @@
       <w:szCs w:val="20"/>
     </w:rPr>
   </w:style>
-  <w:style w:type="table" w:styleId="aa">
+  <w:style w:type="table" w:styleId="TableGrid">
     <w:name w:val="Table Grid"/>
-    <w:basedOn w:val="a1"/>
+    <w:basedOn w:val="TableNormal"/>
     <w:uiPriority w:val="59"/>
     <w:rsid w:val="000D23C7"/>
     <w:pPr>
@@ -3859,10 +3872,10 @@
       </w:tblBorders>
     </w:tblPr>
   </w:style>
-  <w:style w:type="paragraph" w:styleId="ab">
+  <w:style w:type="paragraph" w:styleId="BodyText">
     <w:name w:val="Body Text"/>
-    <w:basedOn w:val="a"/>
-    <w:link w:val="ac"/>
+    <w:basedOn w:val="Normal"/>
+    <w:link w:val="BodyTextChar"/>
     <w:rsid w:val="00DD0958"/>
     <w:pPr>
       <w:tabs>
@@ -3877,10 +3890,10 @@
       <w:szCs w:val="32"/>
     </w:rPr>
   </w:style>
-  <w:style w:type="character" w:customStyle="1" w:styleId="ac">
-    <w:name w:val="เนื้อความ อักขระ"/>
-    <w:basedOn w:val="a0"/>
-    <w:link w:val="ab"/>
+  <w:style w:type="character" w:customStyle="1" w:styleId="BodyTextChar">
+    <w:name w:val="Body Text Char"/>
+    <w:basedOn w:val="DefaultParagraphFont"/>
+    <w:link w:val="BodyText"/>
     <w:rsid w:val="00DD0958"/>
     <w:rPr>
       <w:rFonts w:ascii="EucrosiaUPC" w:eastAsia="Cordia New" w:hAnsi="EucrosiaUPC" w:cs="EucrosiaUPC"/>
@@ -3890,12 +3903,12 @@
   </w:style>
   <w:style w:type="character" w:customStyle="1" w:styleId="apple-style-span">
     <w:name w:val="apple-style-span"/>
-    <w:basedOn w:val="a0"/>
+    <w:basedOn w:val="DefaultParagraphFont"/>
     <w:rsid w:val="00DD0958"/>
   </w:style>
-  <w:style w:type="table" w:styleId="ad">
+  <w:style w:type="table" w:styleId="TableGridLight">
     <w:name w:val="Grid Table Light"/>
-    <w:basedOn w:val="a1"/>
+    <w:basedOn w:val="TableNormal"/>
     <w:uiPriority w:val="40"/>
     <w:rsid w:val="00DD0958"/>
     <w:pPr>

</xml_diff>